<commit_message>
BAMKO Marketing Ops Manager: refreshed on current profile (1 page, conversion tracking and BigQuery added), cover letter added, score 77
Co-Authored-By: Claude Opus 5.5 <noreply@anthropic.com>
Claude-Session: https://claude.ai/code/session_01FBRQCEuHNbZjQ9zAhKMdjS
</commit_message>
<xml_diff>
--- a/applications/bamko-marketing-operations-manager/BAMKO-MarketingOpsManager-Resume.docx
+++ b/applications/bamko-marketing-operations-manager/BAMKO-MarketingOpsManager-Resume.docx
@@ -31,7 +31,7 @@
           <w:color w:val="555555"/>
           <w:sz w:val="23"/>
         </w:rPr>
-        <w:t>Marketing Operations &amp; Analytics | HubSpot, CRM Integrations, GA4 &amp; Revenue Attribution</w:t>
+        <w:t>Marketing Operations | HubSpot, CRM Integrations, Conversion Tracking &amp; Executive Dashboards</w:t>
       </w:r>
     </w:p>
     <w:p>
@@ -80,7 +80,7 @@
           <w:i w:val="0"/>
           <w:color w:val="1A1A1A"/>
         </w:rPr>
-        <w:t>Marketing operations builder who sets the system and then builds it: CRM architecture in HubSpot and GoHighLevel, the integrations and sync logic that connect it to the rest of the business, and the tracking, attribution, and dashboards that show leadership what marketing contributes to pipeline. 5+ years building CRM and marketing automation (lifecycle stages, lead scoring, routing, data governance) on top of 15+ years in B2B SaaS and agency roles, including long, multi-stakeholder sales cycles sold to C-suite buyers. Works in SQL, Power BI, GA4, and Google Tag Manager, and documents every system so it outlasts the person who built it.</w:t>
+        <w:t>Marketing operations builder who sets the standard and then builds it. I architect HubSpot and GoHighLevel CRMs (properties, lifecycle stages, lead scoring, routing, data hygiene), build CRM integrations through webhooks, REST APIs, Zapier, Make, and n8n, and install conversion tracking myself through GA4, GTM, Meta Pixel, and Google Ads tags. I build dashboards in Power BI and SQL, including BigQuery pulls of GA4 data, and a decade on the B2B sales side means I know how long, multi-stakeholder deals actually move.</w:t>
       </w:r>
     </w:p>
     <w:p>
@@ -117,7 +117,7 @@
           <w:color w:val="1A1A1A"/>
           <w:sz w:val="21"/>
         </w:rPr>
-        <w:t>Marketing Operations &amp; Analytics (Founder &amp; Strategic / Marketing Operations Lead)</w:t>
+        <w:t>Marketing Operations Lead — Founder &amp; Strategic / Marketing Operations Lead</w:t>
       </w:r>
       <w:r>
         <w:rPr>
@@ -177,7 +177,7 @@
           <w:i w:val="0"/>
           <w:color w:val="1A1A1A"/>
         </w:rPr>
-        <w:t>Architect and administer CRM and marketing automation systems in HubSpot and GoHighLevel, setting the standards for properties, lifecycle stages, lead scoring, segmentation, and data-hygiene rules.</w:t>
+        <w:t>Architect CRM systems in HubSpot and GoHighLevel: properties, segmentation, lifecycle stages, lead scoring and qualification, routing, and data-hygiene standards.</w:t>
       </w:r>
     </w:p>
     <w:p>
@@ -201,7 +201,7 @@
           <w:i w:val="0"/>
           <w:color w:val="1A1A1A"/>
         </w:rPr>
-        <w:t>Built 20+ workflows covering lead capture, routing, qualification, booking, onboarding nurture, and reactivation, so every inbound lead reaches the right next step without manual handoff.</w:t>
+        <w:t>Build integrations between CRMs and outside systems through webhooks, REST APIs, OAuth/API-key credentials, Zapier, Make, and n8n, and maintain marketing-to-CRM syncs.</w:t>
       </w:r>
     </w:p>
     <w:p>
@@ -225,7 +225,7 @@
           <w:i w:val="0"/>
           <w:color w:val="1A1A1A"/>
         </w:rPr>
-        <w:t>Integrate CRMs with business systems through Zapier, Make, and n8n using webhooks and REST APIs, owning field mapping, sync logic, and data quality across connected tools.</w:t>
+        <w:t>Install and debug conversion tracking: GA4 events, Meta Pixel, and Google Ads tags through custom GTM triggers and variables, with UTM conventions I define and enforce.</w:t>
       </w:r>
     </w:p>
     <w:p>
@@ -249,7 +249,7 @@
           <w:i w:val="0"/>
           <w:color w:val="1A1A1A"/>
         </w:rPr>
-        <w:t>Install Google Tag Manager and GA4 tracking on every site I build, and query GA4 data in BigQuery and SQL to model performance in Power BI.</w:t>
+        <w:t>Build dashboards tracking lead generation, funnel progression, campaign ROI, and pipeline velocity in Power BI and SQL (BigQuery/GA4), delivering insights to leadership.</w:t>
       </w:r>
     </w:p>
     <w:p>
@@ -273,31 +273,7 @@
           <w:i w:val="0"/>
           <w:color w:val="1A1A1A"/>
         </w:rPr>
-        <w:t>Build dashboards tracking lead generation, funnel progression, campaign ROI, and pipeline velocity, and present the findings and recommendations to business owners.</w:t>
-      </w:r>
-    </w:p>
-    <w:p>
-      <w:pPr>
-        <w:spacing w:after="30"/>
-        <w:ind w:left="259" w:hanging="259"/>
-      </w:pPr>
-      <w:r>
-        <w:rPr>
-          <w:rFonts w:ascii="Calibri" w:hAnsi="Calibri"/>
-          <w:b w:val="0"/>
-          <w:i w:val="0"/>
-          <w:color w:val="163A5F"/>
-        </w:rPr>
-        <w:t xml:space="preserve">•  </w:t>
-      </w:r>
-      <w:r>
-        <w:rPr>
-          <w:rFonts w:ascii="Calibri" w:hAnsi="Calibri"/>
-          <w:b w:val="0"/>
-          <w:i w:val="0"/>
-          <w:color w:val="1A1A1A"/>
-        </w:rPr>
-        <w:t>Diagnosed a client's Google Ads account end to end, cutting spam and low-quality leads and identifying on-site conversion as the remaining bottleneck.</w:t>
+        <w:t>Validate every data import into Salesforce, HubSpot, and GoHighLevel, and hold email deliverability above 99%.</w:t>
       </w:r>
     </w:p>
     <w:p>
@@ -375,55 +351,7 @@
           <w:i w:val="0"/>
           <w:color w:val="1A1A1A"/>
         </w:rPr>
-        <w:t>Built campaign performance reporting frameworks tracking ROI, CAC, LTV, and conversion KPIs, and presented the results and recommendations in client QBRs.</w:t>
-      </w:r>
-    </w:p>
-    <w:p>
-      <w:pPr>
-        <w:spacing w:after="30"/>
-        <w:ind w:left="259" w:hanging="259"/>
-      </w:pPr>
-      <w:r>
-        <w:rPr>
-          <w:rFonts w:ascii="Calibri" w:hAnsi="Calibri"/>
-          <w:b w:val="0"/>
-          <w:i w:val="0"/>
-          <w:color w:val="163A5F"/>
-        </w:rPr>
-        <w:t xml:space="preserve">•  </w:t>
-      </w:r>
-      <w:r>
-        <w:rPr>
-          <w:rFonts w:ascii="Calibri" w:hAnsi="Calibri"/>
-          <w:b w:val="0"/>
-          <w:i w:val="0"/>
-          <w:color w:val="1A1A1A"/>
-        </w:rPr>
-        <w:t>Managed ~3 client accounts at $20K+/month in ad spend each (peaking above $100K/month), advising on budget allocation across paid channels.</w:t>
-      </w:r>
-    </w:p>
-    <w:p>
-      <w:pPr>
-        <w:spacing w:after="30"/>
-        <w:ind w:left="259" w:hanging="259"/>
-      </w:pPr>
-      <w:r>
-        <w:rPr>
-          <w:rFonts w:ascii="Calibri" w:hAnsi="Calibri"/>
-          <w:b w:val="0"/>
-          <w:i w:val="0"/>
-          <w:color w:val="163A5F"/>
-        </w:rPr>
-        <w:t xml:space="preserve">•  </w:t>
-      </w:r>
-      <w:r>
-        <w:rPr>
-          <w:rFonts w:ascii="Calibri" w:hAnsi="Calibri"/>
-          <w:b w:val="0"/>
-          <w:i w:val="0"/>
-          <w:color w:val="1A1A1A"/>
-        </w:rPr>
-        <w:t>Ran account-based LinkedIn campaigns against small, highly researched target-account lists with A/B-tested setups.</w:t>
+        <w:t>Ran A/B-tested, account-based LinkedIn campaigns and planned budgets across ~3 accounts at $20K+/month in ad spend each, peaking above $100K/month, reporting ROI, CAC, and LTV in QBRs.</w:t>
       </w:r>
     </w:p>
     <w:p>
@@ -501,31 +429,7 @@
           <w:i w:val="0"/>
           <w:color w:val="1A1A1A"/>
         </w:rPr>
-        <w:t>Managed 15-20 reseller partners selling Birdeye through a multi-channel model (deals ~$10K-$45K), retaining all but one (~94%), in a Salesforce stack with ZoomInfo and intent data synced in.</w:t>
-      </w:r>
-    </w:p>
-    <w:p>
-      <w:pPr>
-        <w:spacing w:after="30"/>
-        <w:ind w:left="259" w:hanging="259"/>
-      </w:pPr>
-      <w:r>
-        <w:rPr>
-          <w:rFonts w:ascii="Calibri" w:hAnsi="Calibri"/>
-          <w:b w:val="0"/>
-          <w:i w:val="0"/>
-          <w:color w:val="163A5F"/>
-        </w:rPr>
-        <w:t xml:space="preserve">•  </w:t>
-      </w:r>
-      <w:r>
-        <w:rPr>
-          <w:rFonts w:ascii="Calibri" w:hAnsi="Calibri"/>
-          <w:b w:val="0"/>
-          <w:i w:val="0"/>
-          <w:color w:val="1A1A1A"/>
-        </w:rPr>
-        <w:t>Analyzed partner utilization and performance data to find adoption gaps and recommend fixes that reduced churn.</w:t>
+        <w:t>Managed a multi-vertical reseller channel of 15-20 partners, retaining all but one (~94%), and worked intent, enrichment, and routing tools synced to Salesforce.</w:t>
       </w:r>
     </w:p>
     <w:p>
@@ -603,31 +507,7 @@
           <w:i w:val="0"/>
           <w:color w:val="1A1A1A"/>
         </w:rPr>
-        <w:t>Built internal processes in HubSpot and ClickUp that improved reporting accuracy and reduced handoff errors between sales and delivery.</w:t>
-      </w:r>
-    </w:p>
-    <w:p>
-      <w:pPr>
-        <w:spacing w:after="30"/>
-        <w:ind w:left="259" w:hanging="259"/>
-      </w:pPr>
-      <w:r>
-        <w:rPr>
-          <w:rFonts w:ascii="Calibri" w:hAnsi="Calibri"/>
-          <w:b w:val="0"/>
-          <w:i w:val="0"/>
-          <w:color w:val="163A5F"/>
-        </w:rPr>
-        <w:t xml:space="preserve">•  </w:t>
-      </w:r>
-      <w:r>
-        <w:rPr>
-          <w:rFonts w:ascii="Calibri" w:hAnsi="Calibri"/>
-          <w:b w:val="0"/>
-          <w:i w:val="0"/>
-          <w:color w:val="1A1A1A"/>
-        </w:rPr>
-        <w:t>Closed 6 deals averaging ~$22K (~$130K+ total bookings) and reached the finalist stage of a long-cycle pursuit of a major banking prospect.</w:t>
+        <w:t>Closed 6 new-client deals averaging ~$22K and built processes that improved reporting accuracy and reduced handoff errors.</w:t>
       </w:r>
     </w:p>
     <w:p>
@@ -705,55 +585,7 @@
           <w:i w:val="0"/>
           <w:color w:val="1A1A1A"/>
         </w:rPr>
-        <w:t>Defined the CRM fields required for outbound sales and onboarding workflows, standardizing data capture across the team.</w:t>
-      </w:r>
-    </w:p>
-    <w:p>
-      <w:pPr>
-        <w:spacing w:after="30"/>
-        <w:ind w:left="259" w:hanging="259"/>
-      </w:pPr>
-      <w:r>
-        <w:rPr>
-          <w:rFonts w:ascii="Calibri" w:hAnsi="Calibri"/>
-          <w:b w:val="0"/>
-          <w:i w:val="0"/>
-          <w:color w:val="163A5F"/>
-        </w:rPr>
-        <w:t xml:space="preserve">•  </w:t>
-      </w:r>
-      <w:r>
-        <w:rPr>
-          <w:rFonts w:ascii="Calibri" w:hAnsi="Calibri"/>
-          <w:b w:val="0"/>
-          <w:i w:val="0"/>
-          <w:color w:val="1A1A1A"/>
-        </w:rPr>
-        <w:t>Contributed to a 30% increase in website traffic and a 25% improvement in conversion rates across the e-commerce segment.</w:t>
-      </w:r>
-    </w:p>
-    <w:p>
-      <w:pPr>
-        <w:spacing w:after="30"/>
-        <w:ind w:left="259" w:hanging="259"/>
-      </w:pPr>
-      <w:r>
-        <w:rPr>
-          <w:rFonts w:ascii="Calibri" w:hAnsi="Calibri"/>
-          <w:b w:val="0"/>
-          <w:i w:val="0"/>
-          <w:color w:val="163A5F"/>
-        </w:rPr>
-        <w:t xml:space="preserve">•  </w:t>
-      </w:r>
-      <w:r>
-        <w:rPr>
-          <w:rFonts w:ascii="Calibri" w:hAnsi="Calibri"/>
-          <w:b w:val="0"/>
-          <w:i w:val="0"/>
-          <w:color w:val="1A1A1A"/>
-        </w:rPr>
-        <w:t>Led multiple onboarding teams of up to 30 specialists while onboarding 25+ clients per month at 120% of sales and 110% of implementation targets.</w:t>
+        <w:t>Contributed to a 30% traffic increase and 25% conversion improvement across the e-commerce segment, holding 120% of sales targets.</w:t>
       </w:r>
     </w:p>
     <w:p>
@@ -831,31 +663,7 @@
           <w:i w:val="0"/>
           <w:color w:val="1A1A1A"/>
         </w:rPr>
-        <w:t>Co-built the team's lead qualification system with sales leadership, and built Zapier automations and API integrations for clients.</w:t>
-      </w:r>
-    </w:p>
-    <w:p>
-      <w:pPr>
-        <w:spacing w:after="30"/>
-        <w:ind w:left="259" w:hanging="259"/>
-      </w:pPr>
-      <w:r>
-        <w:rPr>
-          <w:rFonts w:ascii="Calibri" w:hAnsi="Calibri"/>
-          <w:b w:val="0"/>
-          <w:i w:val="0"/>
-          <w:color w:val="163A5F"/>
-        </w:rPr>
-        <w:t xml:space="preserve">•  </w:t>
-      </w:r>
-      <w:r>
-        <w:rPr>
-          <w:rFonts w:ascii="Calibri" w:hAnsi="Calibri"/>
-          <w:b w:val="0"/>
-          <w:i w:val="0"/>
-          <w:color w:val="1A1A1A"/>
-        </w:rPr>
-        <w:t>Sold multi-stakeholder CRM/PSA deals to C-suite buyers, ranking top three on a team of 8 to 15 reps while quota roughly doubled.</w:t>
+        <w:t>Sold complex CRM and project-management software through long, multi-stakeholder cycles with C-suite buyers, ranking top three on a team of 8-15 reps.</w:t>
       </w:r>
     </w:p>
     <w:p>
@@ -888,7 +696,7 @@
           <w:i w:val="0"/>
           <w:color w:val="1A1A1A"/>
         </w:rPr>
-        <w:t xml:space="preserve">Marketing Ops &amp; CRM:  </w:t>
+        <w:t xml:space="preserve">Marketing Ops:  </w:t>
       </w:r>
       <w:r>
         <w:rPr>
@@ -897,7 +705,7 @@
           <w:i w:val="0"/>
           <w:color w:val="1A1A1A"/>
         </w:rPr>
-        <w:t>HubSpot, GoHighLevel, Salesforce, Lifecycle Stages &amp; Lead Scoring, Lead Routing &amp; Sales Handoff, Data Governance &amp; Field Mapping, Segmentation &amp; List Strategy</w:t>
+        <w:t>HubSpot Administration, Lead Scoring &amp; Routing, CRM Integrations, Conversion Tracking &amp; GTM, Data Governance</w:t>
       </w:r>
     </w:p>
     <w:p>
@@ -911,7 +719,7 @@
           <w:i w:val="0"/>
           <w:color w:val="1A1A1A"/>
         </w:rPr>
-        <w:t xml:space="preserve">Measurement &amp; Analytics:  </w:t>
+        <w:t xml:space="preserve">Data &amp; Tools:  </w:t>
       </w:r>
       <w:r>
         <w:rPr>
@@ -920,30 +728,7 @@
           <w:i w:val="0"/>
           <w:color w:val="1A1A1A"/>
         </w:rPr>
-        <w:t>GA4, Google Tag Manager, Campaign Attribution, SQL &amp; GA4 BigQuery, Power BI, Excel, Executive Dashboards</w:t>
-      </w:r>
-    </w:p>
-    <w:p>
-      <w:pPr>
-        <w:spacing w:after="30"/>
-      </w:pPr>
-      <w:r>
-        <w:rPr>
-          <w:rFonts w:ascii="Calibri" w:hAnsi="Calibri"/>
-          <w:b/>
-          <w:i w:val="0"/>
-          <w:color w:val="1A1A1A"/>
-        </w:rPr>
-        <w:t xml:space="preserve">Integrations &amp; Stack:  </w:t>
-      </w:r>
-      <w:r>
-        <w:rPr>
-          <w:rFonts w:ascii="Calibri" w:hAnsi="Calibri"/>
-          <w:b w:val="0"/>
-          <w:i w:val="0"/>
-          <w:color w:val="1A1A1A"/>
-        </w:rPr>
-        <w:t>Zapier, Make, n8n, Webhooks, REST APIs, JSON, ZoomInfo, Apollo, Google Ads, Meta Ads (certified), LinkedIn Ads</w:t>
+        <w:t>GA4 &amp; BigQuery, Power BI, SQL, Salesforce, ZoomInfo, Apollo, Zapier, Make, n8n</w:t>
       </w:r>
     </w:p>
     <w:p>
@@ -977,53 +762,6 @@
           <w:color w:val="1A1A1A"/>
         </w:rPr>
         <w:t>B.A. Liberal Arts, Minor in Political Science - Colorado State University, Fort Collins, CO</w:t>
-      </w:r>
-    </w:p>
-    <w:p>
-      <w:pPr>
-        <w:spacing w:before="140" w:after="60"/>
-        <w:pBdr>
-          <w:bottom w:val="single" w:sz="6" w:space="2" w:color="163a5f"/>
-        </w:pBdr>
-      </w:pPr>
-      <w:r>
-        <w:rPr>
-          <w:rFonts w:ascii="Calibri" w:hAnsi="Calibri"/>
-          <w:b/>
-          <w:i w:val="0"/>
-          <w:caps/>
-          <w:color w:val="163A5F"/>
-          <w:sz w:val="21"/>
-        </w:rPr>
-        <w:t>CERTIFICATIONS</w:t>
-      </w:r>
-    </w:p>
-    <w:p>
-      <w:pPr>
-        <w:spacing w:after="30"/>
-      </w:pPr>
-      <w:r>
-        <w:rPr>
-          <w:rFonts w:ascii="Calibri" w:hAnsi="Calibri"/>
-          <w:b w:val="0"/>
-          <w:i w:val="0"/>
-          <w:color w:val="1A1A1A"/>
-        </w:rPr>
-        <w:t>Google Digital Marketing &amp; E-Commerce Professional Certificate (2024)</w:t>
-      </w:r>
-    </w:p>
-    <w:p>
-      <w:pPr>
-        <w:spacing w:after="30"/>
-      </w:pPr>
-      <w:r>
-        <w:rPr>
-          <w:rFonts w:ascii="Calibri" w:hAnsi="Calibri"/>
-          <w:b w:val="0"/>
-          <w:i w:val="0"/>
-          <w:color w:val="1A1A1A"/>
-        </w:rPr>
-        <w:t>Meta Ads Certification</w:t>
       </w:r>
     </w:p>
     <w:sectPr>

</xml_diff>